<commit_message>
Add UserMS registration and login APIs
</commit_message>
<xml_diff>
--- a/Documentation/System Design/Step 3 Use Cases and System WorkflowsStep 3 Use Cases and System Workflows.docx
+++ b/Documentation/System Design/Step 3 Use Cases and System WorkflowsStep 3 Use Cases and System Workflows.docx
@@ -3813,12 +3813,28 @@
     </w:p>
     <w:p>
       <w:r>
-        <w:t>What exact tie-break sequence should be used for teams level on points?</w:t>
-      </w:r>
-    </w:p>
-    <w:p>
-      <w:r>
-        <w:t>What are the allowed knockout tie-resolution rules: extra time, penalties, walkover, or other outcomes?</w:t>
+        <w:t xml:space="preserve">What exact tie-break sequence should be used for </w:t>
+      </w:r>
+      <w:proofErr w:type="gramStart"/>
+      <w:r>
+        <w:t>teams</w:t>
+      </w:r>
+      <w:proofErr w:type="gramEnd"/>
+      <w:r>
+        <w:t xml:space="preserve"> level on points?</w:t>
+      </w:r>
+    </w:p>
+    <w:p>
+      <w:r>
+        <w:t xml:space="preserve">What </w:t>
+      </w:r>
+      <w:proofErr w:type="gramStart"/>
+      <w:r>
+        <w:t>are</w:t>
+      </w:r>
+      <w:proofErr w:type="gramEnd"/>
+      <w:r>
+        <w:t xml:space="preserve"> the allowed knockout tie-resolution rules: extra time, penalties, walkover, or other outcomes?</w:t>
       </w:r>
     </w:p>
     <w:p>
@@ -3838,7 +3854,15 @@
     </w:p>
     <w:p>
       <w:r>
-        <w:t>Which fixture scheduling constraints are mandatory (venue availability, rest days, kickoff windows, home/away balance)?</w:t>
+        <w:t xml:space="preserve">Which fixture scheduling constraints are mandatory (venue availability, rest days, </w:t>
+      </w:r>
+      <w:proofErr w:type="spellStart"/>
+      <w:r>
+        <w:t>kickoff</w:t>
+      </w:r>
+      <w:proofErr w:type="spellEnd"/>
+      <w:r>
+        <w:t xml:space="preserve"> windows, home/away balance)?</w:t>
       </w:r>
     </w:p>
     <w:p>
@@ -3871,7 +3895,90 @@
       </w:r>
     </w:p>
     <w:p/>
-    <w:p/>
+    <w:p>
+      <w:r>
+        <w:rPr>
+          <w:noProof/>
+        </w:rPr>
+        <w:lastRenderedPageBreak/>
+        <w:drawing>
+          <wp:inline distT="0" distB="0" distL="0" distR="0" wp14:anchorId="594B65D1" wp14:editId="2D1E30BF">
+            <wp:extent cx="5731510" cy="6802755"/>
+            <wp:effectExtent l="0" t="0" r="2540" b="0"/>
+            <wp:docPr id="1595748375" name="Picture 1"/>
+            <wp:cNvGraphicFramePr>
+              <a:graphicFrameLocks xmlns:a="http://schemas.openxmlformats.org/drawingml/2006/main" noChangeAspect="1"/>
+            </wp:cNvGraphicFramePr>
+            <a:graphic xmlns:a="http://schemas.openxmlformats.org/drawingml/2006/main">
+              <a:graphicData uri="http://schemas.openxmlformats.org/drawingml/2006/picture">
+                <pic:pic xmlns:pic="http://schemas.openxmlformats.org/drawingml/2006/picture">
+                  <pic:nvPicPr>
+                    <pic:cNvPr id="1595748375" name=""/>
+                    <pic:cNvPicPr/>
+                  </pic:nvPicPr>
+                  <pic:blipFill>
+                    <a:blip r:embed="rId4"/>
+                    <a:stretch>
+                      <a:fillRect/>
+                    </a:stretch>
+                  </pic:blipFill>
+                  <pic:spPr>
+                    <a:xfrm>
+                      <a:off x="0" y="0"/>
+                      <a:ext cx="5731510" cy="6802755"/>
+                    </a:xfrm>
+                    <a:prstGeom prst="rect">
+                      <a:avLst/>
+                    </a:prstGeom>
+                  </pic:spPr>
+                </pic:pic>
+              </a:graphicData>
+            </a:graphic>
+          </wp:inline>
+        </w:drawing>
+      </w:r>
+      <w:r>
+        <w:rPr>
+          <w:noProof/>
+        </w:rPr>
+        <w:lastRenderedPageBreak/>
+        <w:drawing>
+          <wp:inline distT="0" distB="0" distL="0" distR="0" wp14:anchorId="33DD4537" wp14:editId="4AB51543">
+            <wp:extent cx="5028571" cy="7714286"/>
+            <wp:effectExtent l="0" t="0" r="635" b="1270"/>
+            <wp:docPr id="1203018079" name="Picture 1"/>
+            <wp:cNvGraphicFramePr>
+              <a:graphicFrameLocks xmlns:a="http://schemas.openxmlformats.org/drawingml/2006/main" noChangeAspect="1"/>
+            </wp:cNvGraphicFramePr>
+            <a:graphic xmlns:a="http://schemas.openxmlformats.org/drawingml/2006/main">
+              <a:graphicData uri="http://schemas.openxmlformats.org/drawingml/2006/picture">
+                <pic:pic xmlns:pic="http://schemas.openxmlformats.org/drawingml/2006/picture">
+                  <pic:nvPicPr>
+                    <pic:cNvPr id="1203018079" name=""/>
+                    <pic:cNvPicPr/>
+                  </pic:nvPicPr>
+                  <pic:blipFill>
+                    <a:blip r:embed="rId5"/>
+                    <a:stretch>
+                      <a:fillRect/>
+                    </a:stretch>
+                  </pic:blipFill>
+                  <pic:spPr>
+                    <a:xfrm>
+                      <a:off x="0" y="0"/>
+                      <a:ext cx="5028571" cy="7714286"/>
+                    </a:xfrm>
+                    <a:prstGeom prst="rect">
+                      <a:avLst/>
+                    </a:prstGeom>
+                  </pic:spPr>
+                </pic:pic>
+              </a:graphicData>
+            </a:graphic>
+          </wp:inline>
+        </w:drawing>
+      </w:r>
+    </w:p>
     <w:sectPr>
       <w:pgSz w:w="11906" w:h="16838"/>
       <w:pgMar w:top="1440" w:right="1440" w:bottom="1440" w:left="1440" w:header="708" w:footer="708" w:gutter="0"/>
@@ -4485,6 +4592,7 @@
   <w:style w:type="character" w:default="1" w:styleId="DefaultParagraphFont">
     <w:name w:val="Default Paragraph Font"/>
     <w:uiPriority w:val="1"/>
+    <w:semiHidden/>
     <w:unhideWhenUsed/>
   </w:style>
   <w:style w:type="table" w:default="1" w:styleId="TableNormal">

</xml_diff>